<commit_message>
Add the four Botero tables to the Tables additions; Ohay's sheet is empty
Co-Authored-By: Claude Opus 5.5 <noreply@anthropic.com>
Claude-Session: https://claude.ai/code/session_01SDAyPG51KSHcsoxof9YnHZ
</commit_message>
<xml_diff>
--- a/docs/livrables/Cattelan-Italia-Maroc-elements-a-fournir.docx
+++ b/docs/livrables/Cattelan-Italia-Maroc-elements-a-fournir.docx
@@ -312,7 +312,7 @@
                 <w:b/>
                 <w:sz w:val="19"/>
               </w:rPr>
-              <w:t>Photos d’ambiance d’Ohay (la fiche produit est reçue)</w:t>
+              <w:t>Photos d’ambiance d’Ohay et sa fiche produit (le PDF reçu est vide)</w:t>
             </w:r>
           </w:p>
         </w:tc>
@@ -652,7 +652,7 @@
         <w:t>Ohay.</w:t>
       </w:r>
       <w:r>
-        <w:t xml:space="preserve"> La fiche produit est reçue ; il manque des photos d’ambiance sans logo, comme pour les autres modèles.</w:t>
+        <w:t xml:space="preserve"> Le PDF de la fiche produit reçu ne contient que l’en-tête et le pied de page : il faut le télécharger à nouveau. Il manque aussi des photos d’ambiance sans logo, comme pour les autres modèles.</w:t>
       </w:r>
     </w:p>
     <w:p>

</xml_diff>